<commit_message>
Add revised institutional position initiation recommendation note
</commit_message>
<xml_diff>
--- a/engines/position_initiation/docs/Institutional_Position_Initiation_Recommendation_Note.docx
+++ b/engines/position_initiation/docs/Institutional_Position_Initiation_Recommendation_Note.docx
@@ -8,11 +8,9 @@
       </w:pPr>
       <w:r>
         <w:rPr>
-          <w:rFonts w:ascii="Aptos" w:hAnsi="Aptos"/>
           <w:b/>
-          <w:i w:val="0"/>
           <w:color w:val="1F4E79"/>
-          <w:sz w:val="40"/>
+          <w:sz w:val="36"/>
         </w:rPr>
         <w:t>Position Initiation Recommendation Note</w:t>
       </w:r>
@@ -23,15 +21,14 @@
       </w:pPr>
       <w:r>
         <w:rPr>
-          <w:rFonts w:ascii="Aptos" w:hAnsi="Aptos"/>
-          <w:b w:val="0"/>
           <w:i/>
           <w:color w:val="5A5A5A"/>
-          <w:sz w:val="21"/>
+          <w:sz w:val="20"/>
         </w:rPr>
-        <w:t>Institutional-grade recommendation based on the provided stop-history scenario</w:t>
+        <w:t>Revised decision memorandum based on the reviewed stop-history scenario</w:t>
       </w:r>
     </w:p>
+    <w:p/>
     <w:tbl>
       <w:tblPr>
         <w:tblW w:type="auto" w:w="0"/>
@@ -46,21 +43,20 @@
       <w:tr>
         <w:tc>
           <w:tcPr>
-            <w:tcW w:type="dxa" w:w="2592"/>
+            <w:tcW w:type="dxa" w:w="4968"/>
             <w:vAlign w:val="center"/>
-            <w:shd w:fill="1F4E79"/>
+            <w:tcMar>
+              <w:top w:w="90" w:type="dxa"/>
+              <w:start w:w="110" w:type="dxa"/>
+              <w:bottom w:w="90" w:type="dxa"/>
+              <w:end w:w="110" w:type="dxa"/>
+            </w:tcMar>
+            <w:shd w:fill="D9EAF7"/>
           </w:tcPr>
           <w:p>
-            <w:pPr>
-              <w:jc w:val="left"/>
-            </w:pPr>
             <w:r>
               <w:rPr>
-                <w:rFonts w:ascii="Aptos" w:hAnsi="Aptos"/>
                 <w:b/>
-                <w:i w:val="0"/>
-                <w:color w:val="FFFFFF"/>
-                <w:sz w:val="22"/>
               </w:rPr>
               <w:t>Recommendation</w:t>
             </w:r>
@@ -68,21 +64,22 @@
         </w:tc>
         <w:tc>
           <w:tcPr>
-            <w:tcW w:type="dxa" w:w="7056"/>
+            <w:tcW w:type="dxa" w:w="4968"/>
             <w:vAlign w:val="center"/>
-            <w:shd w:fill="FDE9E7"/>
+            <w:tcMar>
+              <w:top w:w="90" w:type="dxa"/>
+              <w:start w:w="110" w:type="dxa"/>
+              <w:bottom w:w="90" w:type="dxa"/>
+              <w:end w:w="110" w:type="dxa"/>
+            </w:tcMar>
+            <w:shd w:fill="F5F9FC"/>
           </w:tcPr>
           <w:p>
-            <w:pPr>
-              <w:jc w:val="center"/>
-            </w:pPr>
             <w:r>
               <w:rPr>
-                <w:rFonts w:ascii="Aptos" w:hAnsi="Aptos"/>
                 <w:b/>
-                <w:i w:val="0"/>
                 <w:color w:val="C00000"/>
-                <w:sz w:val="22"/>
+                <w:sz w:val="28"/>
               </w:rPr>
               <w:t>NONE</w:t>
             </w:r>
@@ -92,35 +89,40 @@
       <w:tr>
         <w:tc>
           <w:tcPr>
-            <w:tcW w:type="dxa" w:w="2592"/>
+            <w:tcW w:type="dxa" w:w="4968"/>
             <w:vAlign w:val="center"/>
+            <w:tcMar>
+              <w:top w:w="90" w:type="dxa"/>
+              <w:start w:w="110" w:type="dxa"/>
+              <w:bottom w:w="90" w:type="dxa"/>
+              <w:end w:w="110" w:type="dxa"/>
+            </w:tcMar>
+            <w:shd w:fill="D9EAF7"/>
           </w:tcPr>
           <w:p>
             <w:r>
               <w:rPr>
-                <w:rFonts w:ascii="Aptos" w:hAnsi="Aptos"/>
                 <w:b/>
-                <w:i w:val="0"/>
-                <w:sz w:val="20"/>
               </w:rPr>
-              <w:t>Decision basis</w:t>
+              <w:t>Reason in one line</w:t>
             </w:r>
           </w:p>
         </w:tc>
         <w:tc>
           <w:tcPr>
-            <w:tcW w:type="dxa" w:w="7056"/>
+            <w:tcW w:type="dxa" w:w="4968"/>
             <w:vAlign w:val="center"/>
+            <w:tcMar>
+              <w:top w:w="90" w:type="dxa"/>
+              <w:start w:w="110" w:type="dxa"/>
+              <w:bottom w:w="90" w:type="dxa"/>
+              <w:end w:w="110" w:type="dxa"/>
+            </w:tcMar>
+            <w:shd w:fill="FFFFFF"/>
           </w:tcPr>
           <w:p>
             <w:r>
-              <w:rPr>
-                <w:rFonts w:ascii="Aptos" w:hAnsi="Aptos"/>
-                <w:b w:val="0"/>
-                <w:i w:val="0"/>
-                <w:sz w:val="20"/>
-              </w:rPr>
-              <w:t>The supplied output is a stop-management simulation, not an entry model. It shows how risk would evolve after a hypothetical long entry, but it does not establish whether initiating the trade has positive expected value.</w:t>
+              <w:t>The reviewed output is a stop-management simulation for an already-assumed long trade; it is not an entry model and therefore does not justify authorizing a new LONG or SHORT position.</w:t>
             </w:r>
           </w:p>
         </w:tc>
@@ -128,18 +130,13 @@
     </w:tbl>
     <w:p/>
     <w:p>
-      <w:pPr>
-        <w:spacing w:after="60"/>
-      </w:pPr>
       <w:r>
         <w:rPr>
-          <w:rFonts w:ascii="Aptos" w:hAnsi="Aptos"/>
           <w:b/>
-          <w:i w:val="0"/>
           <w:color w:val="1F4E79"/>
-          <w:sz w:val="25"/>
+          <w:sz w:val="26"/>
         </w:rPr>
-        <w:t>Document purpose</w:t>
+        <w:t>1. Decision Summary</w:t>
       </w:r>
     </w:p>
     <w:p>
@@ -147,13 +144,7 @@
         <w:spacing w:after="80"/>
       </w:pPr>
       <w:r>
-        <w:rPr>
-          <w:rFonts w:ascii="Aptos" w:hAnsi="Aptos"/>
-          <w:b w:val="0"/>
-          <w:i w:val="0"/>
-          <w:sz w:val="21"/>
-        </w:rPr>
-        <w:t>This note records a disciplined recommendation on whether a new position should be initiated from the scenario reviewed in the stop-history what-if output.</w:t>
+        <w:t>The scenario reviewed was a what-if stop-history path for an assumed long futures position. It demonstrates how stop risk would have evolved after entry, but it does not establish that a new entry had positive expected value.</w:t>
       </w:r>
     </w:p>
     <w:p>
@@ -161,88 +152,25 @@
         <w:spacing w:after="80"/>
       </w:pPr>
       <w:r>
-        <w:rPr>
-          <w:rFonts w:ascii="Aptos" w:hAnsi="Aptos"/>
-          <w:b w:val="0"/>
-          <w:i w:val="0"/>
-          <w:sz w:val="21"/>
-        </w:rPr>
-        <w:t>The analysis conclusion is intentionally narrow: the stop-history path is useful for post-entry risk management, but it is not sufficient on its own to authorize a new trade.</w:t>
+        <w:t>A disciplined institutional recommendation cannot be upgraded to LONG because the material required for entry authorization is absent: there is no validated trigger, no expected reward framework, no expectancy evidence, and no documented comparison between initial risk and likely payoff.</w:t>
       </w:r>
     </w:p>
     <w:p>
       <w:pPr>
-        <w:spacing w:after="60"/>
+        <w:spacing w:after="80"/>
       </w:pPr>
       <w:r>
-        <w:rPr>
-          <w:rFonts w:ascii="Aptos" w:hAnsi="Aptos"/>
-          <w:b/>
-          <w:i w:val="0"/>
-          <w:color w:val="1F4E79"/>
-          <w:sz w:val="25"/>
-        </w:rPr>
-        <w:t>Why the recommendation is NONE</w:t>
+        <w:t>A SHORT recommendation is also not supported. The scenario contains no short-side thesis, no short entry trigger, and no evidence that the instrument should be sold short rather than avoided.</w:t>
       </w:r>
     </w:p>
     <w:p>
-      <w:pPr>
-        <w:pStyle w:val="ListBullet"/>
-        <w:spacing w:after="20"/>
-      </w:pPr>
-      <w:r>
-        <w:t>The scenario is conditional on already being long from a selected entry date and price.</w:t>
-      </w:r>
-    </w:p>
-    <w:p>
-      <w:pPr>
-        <w:pStyle w:val="ListBullet"/>
-        <w:spacing w:after="20"/>
-      </w:pPr>
-      <w:r>
-        <w:t>It does not supply an entry signal, entry thesis, or evidence of edge.</w:t>
-      </w:r>
-    </w:p>
-    <w:p>
-      <w:pPr>
-        <w:pStyle w:val="ListBullet"/>
-        <w:spacing w:after="20"/>
-      </w:pPr>
-      <w:r>
-        <w:t>It does not provide a reward target or expected upside to compare against initial stop risk.</w:t>
-      </w:r>
-    </w:p>
-    <w:p>
-      <w:pPr>
-        <w:pStyle w:val="ListBullet"/>
-        <w:spacing w:after="20"/>
-      </w:pPr>
-      <w:r>
-        <w:t>It does not show expected value, win rate, drawdown behaviour, or market-regime robustness.</w:t>
-      </w:r>
-    </w:p>
-    <w:p>
-      <w:pPr>
-        <w:pStyle w:val="ListBullet"/>
-        <w:spacing w:after="20"/>
-      </w:pPr>
-      <w:r>
-        <w:t>It therefore supports trade management, not trade authorization.</w:t>
-      </w:r>
-    </w:p>
-    <w:p>
-      <w:pPr>
-        <w:spacing w:after="60"/>
-      </w:pPr>
       <w:r>
         <w:rPr>
-          <w:rFonts w:ascii="Aptos" w:hAnsi="Aptos"/>
           <w:b/>
-          <w:i w:val="0"/>
           <w:color w:val="1F4E79"/>
-          <w:sz w:val="25"/>
+          <w:sz w:val="26"/>
         </w:rPr>
-        <w:t>What the scenario does prove</w:t>
+        <w:t>2. Scenario Facts Used in This Review</w:t>
       </w:r>
     </w:p>
     <w:tbl>
@@ -253,8 +181,389 @@
         <w:tblLook w:firstColumn="1" w:firstRow="1" w:lastColumn="0" w:lastRow="0" w:noHBand="0" w:noVBand="1" w:val="04A0"/>
       </w:tblPr>
       <w:tblGrid>
-        <w:gridCol w:w="3312"/>
-        <w:gridCol w:w="6336"/>
+        <w:gridCol w:w="2736"/>
+        <w:gridCol w:w="2304"/>
+        <w:gridCol w:w="4752"/>
+      </w:tblGrid>
+      <w:tr>
+        <w:tc>
+          <w:tcPr>
+            <w:tcW w:type="dxa" w:w="3312"/>
+            <w:shd w:fill="D9EAF7"/>
+            <w:vAlign w:val="center"/>
+            <w:tcMar>
+              <w:top w:w="80" w:type="dxa"/>
+              <w:start w:w="110" w:type="dxa"/>
+              <w:bottom w:w="80" w:type="dxa"/>
+              <w:end w:w="110" w:type="dxa"/>
+            </w:tcMar>
+          </w:tcPr>
+          <w:p>
+            <w:r>
+              <w:rPr>
+                <w:b/>
+              </w:rPr>
+              <w:t>Observed item</w:t>
+            </w:r>
+          </w:p>
+        </w:tc>
+        <w:tc>
+          <w:tcPr>
+            <w:tcW w:type="dxa" w:w="3312"/>
+            <w:shd w:fill="D9EAF7"/>
+            <w:vAlign w:val="center"/>
+            <w:tcMar>
+              <w:top w:w="80" w:type="dxa"/>
+              <w:start w:w="110" w:type="dxa"/>
+              <w:bottom w:w="80" w:type="dxa"/>
+              <w:end w:w="110" w:type="dxa"/>
+            </w:tcMar>
+          </w:tcPr>
+          <w:p>
+            <w:r>
+              <w:rPr>
+                <w:b/>
+              </w:rPr>
+              <w:t>Value</w:t>
+            </w:r>
+          </w:p>
+        </w:tc>
+        <w:tc>
+          <w:tcPr>
+            <w:tcW w:type="dxa" w:w="3312"/>
+            <w:shd w:fill="D9EAF7"/>
+            <w:vAlign w:val="center"/>
+            <w:tcMar>
+              <w:top w:w="80" w:type="dxa"/>
+              <w:start w:w="110" w:type="dxa"/>
+              <w:bottom w:w="80" w:type="dxa"/>
+              <w:end w:w="110" w:type="dxa"/>
+            </w:tcMar>
+          </w:tcPr>
+          <w:p>
+            <w:r>
+              <w:rPr>
+                <w:b/>
+              </w:rPr>
+              <w:t>Why it matters</w:t>
+            </w:r>
+          </w:p>
+        </w:tc>
+      </w:tr>
+      <w:tr>
+        <w:tc>
+          <w:tcPr>
+            <w:tcW w:type="dxa" w:w="2736"/>
+            <w:vAlign w:val="center"/>
+            <w:tcMar>
+              <w:top w:w="80" w:type="dxa"/>
+              <w:start w:w="110" w:type="dxa"/>
+              <w:bottom w:w="80" w:type="dxa"/>
+              <w:end w:w="110" w:type="dxa"/>
+            </w:tcMar>
+          </w:tcPr>
+          <w:p>
+            <w:r>
+              <w:t>Instrument / scenario</w:t>
+            </w:r>
+          </w:p>
+        </w:tc>
+        <w:tc>
+          <w:tcPr>
+            <w:tcW w:type="dxa" w:w="2304"/>
+            <w:vAlign w:val="center"/>
+            <w:tcMar>
+              <w:top w:w="80" w:type="dxa"/>
+              <w:start w:w="110" w:type="dxa"/>
+              <w:bottom w:w="80" w:type="dxa"/>
+              <w:end w:w="110" w:type="dxa"/>
+            </w:tcMar>
+          </w:tcPr>
+          <w:p>
+            <w:r>
+              <w:t>INFY26APRFUT what-if long path</w:t>
+            </w:r>
+          </w:p>
+        </w:tc>
+        <w:tc>
+          <w:tcPr>
+            <w:tcW w:type="dxa" w:w="4752"/>
+            <w:vAlign w:val="center"/>
+            <w:tcMar>
+              <w:top w:w="80" w:type="dxa"/>
+              <w:start w:w="110" w:type="dxa"/>
+              <w:bottom w:w="80" w:type="dxa"/>
+              <w:end w:w="110" w:type="dxa"/>
+            </w:tcMar>
+          </w:tcPr>
+          <w:p>
+            <w:r>
+              <w:t>The reviewed table is conditional on already being long; it is not an initiation signal.</w:t>
+            </w:r>
+          </w:p>
+        </w:tc>
+      </w:tr>
+      <w:tr>
+        <w:tc>
+          <w:tcPr>
+            <w:tcW w:type="dxa" w:w="2736"/>
+            <w:vAlign w:val="center"/>
+            <w:tcMar>
+              <w:top w:w="80" w:type="dxa"/>
+              <w:start w:w="110" w:type="dxa"/>
+              <w:bottom w:w="80" w:type="dxa"/>
+              <w:end w:w="110" w:type="dxa"/>
+            </w:tcMar>
+          </w:tcPr>
+          <w:p>
+            <w:r>
+              <w:t>Assumed entry</w:t>
+            </w:r>
+          </w:p>
+        </w:tc>
+        <w:tc>
+          <w:tcPr>
+            <w:tcW w:type="dxa" w:w="2304"/>
+            <w:vAlign w:val="center"/>
+            <w:tcMar>
+              <w:top w:w="80" w:type="dxa"/>
+              <w:start w:w="110" w:type="dxa"/>
+              <w:bottom w:w="80" w:type="dxa"/>
+              <w:end w:w="110" w:type="dxa"/>
+            </w:tcMar>
+          </w:tcPr>
+          <w:p>
+            <w:r>
+              <w:t>1 lot, entry price 1292.50 on 2026-04-01</w:t>
+            </w:r>
+          </w:p>
+        </w:tc>
+        <w:tc>
+          <w:tcPr>
+            <w:tcW w:type="dxa" w:w="4752"/>
+            <w:vAlign w:val="center"/>
+            <w:tcMar>
+              <w:top w:w="80" w:type="dxa"/>
+              <w:start w:w="110" w:type="dxa"/>
+              <w:bottom w:w="80" w:type="dxa"/>
+              <w:end w:w="110" w:type="dxa"/>
+            </w:tcMar>
+          </w:tcPr>
+          <w:p>
+            <w:r>
+              <w:t>This defines risk after the fact; it does not prove the entry itself was valid.</w:t>
+            </w:r>
+          </w:p>
+        </w:tc>
+      </w:tr>
+      <w:tr>
+        <w:tc>
+          <w:tcPr>
+            <w:tcW w:type="dxa" w:w="2736"/>
+            <w:vAlign w:val="center"/>
+            <w:tcMar>
+              <w:top w:w="80" w:type="dxa"/>
+              <w:start w:w="110" w:type="dxa"/>
+              <w:bottom w:w="80" w:type="dxa"/>
+              <w:end w:w="110" w:type="dxa"/>
+            </w:tcMar>
+          </w:tcPr>
+          <w:p>
+            <w:r>
+              <w:t>Initial stop risk</w:t>
+            </w:r>
+          </w:p>
+        </w:tc>
+        <w:tc>
+          <w:tcPr>
+            <w:tcW w:type="dxa" w:w="2304"/>
+            <w:vAlign w:val="center"/>
+            <w:tcMar>
+              <w:top w:w="80" w:type="dxa"/>
+              <w:start w:w="110" w:type="dxa"/>
+              <w:bottom w:w="80" w:type="dxa"/>
+              <w:end w:w="110" w:type="dxa"/>
+            </w:tcMar>
+          </w:tcPr>
+          <w:p>
+            <w:r>
+              <w:t>Risk per unit 56.80; total initial risk 22,720</w:t>
+            </w:r>
+          </w:p>
+        </w:tc>
+        <w:tc>
+          <w:tcPr>
+            <w:tcW w:type="dxa" w:w="4752"/>
+            <w:vAlign w:val="center"/>
+            <w:tcMar>
+              <w:top w:w="80" w:type="dxa"/>
+              <w:start w:w="110" w:type="dxa"/>
+              <w:bottom w:w="80" w:type="dxa"/>
+              <w:end w:w="110" w:type="dxa"/>
+            </w:tcMar>
+          </w:tcPr>
+          <w:p>
+            <w:r>
+              <w:t>This quantifies downside after entry, but not whether the trade deserved to be opened.</w:t>
+            </w:r>
+          </w:p>
+        </w:tc>
+      </w:tr>
+      <w:tr>
+        <w:tc>
+          <w:tcPr>
+            <w:tcW w:type="dxa" w:w="2736"/>
+            <w:vAlign w:val="center"/>
+            <w:tcMar>
+              <w:top w:w="80" w:type="dxa"/>
+              <w:start w:w="110" w:type="dxa"/>
+              <w:bottom w:w="80" w:type="dxa"/>
+              <w:end w:w="110" w:type="dxa"/>
+            </w:tcMar>
+          </w:tcPr>
+          <w:p>
+            <w:r>
+              <w:t>Latest reviewed state</w:t>
+            </w:r>
+          </w:p>
+        </w:tc>
+        <w:tc>
+          <w:tcPr>
+            <w:tcW w:type="dxa" w:w="2304"/>
+            <w:vAlign w:val="center"/>
+            <w:tcMar>
+              <w:top w:w="80" w:type="dxa"/>
+              <w:start w:w="110" w:type="dxa"/>
+              <w:bottom w:w="80" w:type="dxa"/>
+              <w:end w:w="110" w:type="dxa"/>
+            </w:tcMar>
+          </w:tcPr>
+          <w:p>
+            <w:r>
+              <w:t>By 2026-04-10, risk per unit tightened to 19.45; total risk to 7,780</w:t>
+            </w:r>
+          </w:p>
+        </w:tc>
+        <w:tc>
+          <w:tcPr>
+            <w:tcW w:type="dxa" w:w="4752"/>
+            <w:vAlign w:val="center"/>
+            <w:tcMar>
+              <w:top w:w="80" w:type="dxa"/>
+              <w:start w:w="110" w:type="dxa"/>
+              <w:bottom w:w="80" w:type="dxa"/>
+              <w:end w:w="110" w:type="dxa"/>
+            </w:tcMar>
+          </w:tcPr>
+          <w:p>
+            <w:r>
+              <w:t>Risk improving after entry is useful for management, not sufficient for authorization.</w:t>
+            </w:r>
+          </w:p>
+        </w:tc>
+      </w:tr>
+    </w:tbl>
+    <w:p/>
+    <w:p>
+      <w:r>
+        <w:rPr>
+          <w:b/>
+          <w:color w:val="1F4E79"/>
+          <w:sz w:val="26"/>
+        </w:rPr>
+        <w:t>3. Why the Recommendation Remains NONE</w:t>
+      </w:r>
+    </w:p>
+    <w:p>
+      <w:pPr>
+        <w:ind w:left="288" w:hanging="259"/>
+      </w:pPr>
+      <w:r>
+        <w:rPr>
+          <w:b/>
+        </w:rPr>
+        <w:t xml:space="preserve">• </w:t>
+      </w:r>
+      <w:r>
+        <w:t>The reviewed output is conditional on an assumed long entry. A conditional simulation cannot be treated as evidence that a position should now be initiated.</w:t>
+      </w:r>
+    </w:p>
+    <w:p>
+      <w:pPr>
+        <w:ind w:left="288" w:hanging="259"/>
+      </w:pPr>
+      <w:r>
+        <w:rPr>
+          <w:b/>
+        </w:rPr>
+        <w:t xml:space="preserve">• </w:t>
+      </w:r>
+      <w:r>
+        <w:t>No entry signal is present. There is no breakout rule, pullback rule, trend confirmation, relative-strength filter, or any other reproducible authorization trigger.</w:t>
+      </w:r>
+    </w:p>
+    <w:p>
+      <w:pPr>
+        <w:ind w:left="288" w:hanging="259"/>
+      </w:pPr>
+      <w:r>
+        <w:rPr>
+          <w:b/>
+        </w:rPr>
+        <w:t xml:space="preserve">• </w:t>
+      </w:r>
+      <w:r>
+        <w:t>No reward case is present. The scenario quantifies downside to stop but does not provide a target, expected reward distribution, or reward-to-risk case.</w:t>
+      </w:r>
+    </w:p>
+    <w:p>
+      <w:pPr>
+        <w:ind w:left="288" w:hanging="259"/>
+      </w:pPr>
+      <w:r>
+        <w:rPr>
+          <w:b/>
+        </w:rPr>
+        <w:t xml:space="preserve">• </w:t>
+      </w:r>
+      <w:r>
+        <w:t>No edge is shown. There is no backtested expectancy, hit rate, drawdown profile, slippage assumption, or regime analysis.</w:t>
+      </w:r>
+    </w:p>
+    <w:p>
+      <w:pPr>
+        <w:ind w:left="288" w:hanging="259"/>
+      </w:pPr>
+      <w:r>
+        <w:rPr>
+          <w:b/>
+        </w:rPr>
+        <w:t xml:space="preserve">• </w:t>
+      </w:r>
+      <w:r>
+        <w:t>No portfolio context is shown. A decision to initiate a position must consider risk budget, exposure concentration, event risk, and competing opportunities.</w:t>
+      </w:r>
+    </w:p>
+    <w:p>
+      <w:r>
+        <w:rPr>
+          <w:b/>
+          <w:color w:val="1F4E79"/>
+          <w:sz w:val="26"/>
+        </w:rPr>
+        <w:t>4. What the Scenario Does Prove</w:t>
+      </w:r>
+    </w:p>
+    <w:tbl>
+      <w:tblPr>
+        <w:tblW w:type="auto" w:w="0"/>
+        <w:jc w:val="center"/>
+        <w:tblLayout w:type="fixed"/>
+        <w:tblLook w:firstColumn="1" w:firstRow="1" w:lastColumn="0" w:lastRow="0" w:noHBand="0" w:noVBand="1" w:val="04A0"/>
+      </w:tblPr>
+      <w:tblGrid>
+        <w:gridCol w:w="3024"/>
+        <w:gridCol w:w="6768"/>
       </w:tblGrid>
       <w:tr>
         <w:tc>
@@ -262,15 +571,17 @@
             <w:tcW w:type="dxa" w:w="4968"/>
             <w:shd w:fill="D9EAF7"/>
             <w:vAlign w:val="center"/>
+            <w:tcMar>
+              <w:top w:w="80" w:type="dxa"/>
+              <w:start w:w="110" w:type="dxa"/>
+              <w:bottom w:w="80" w:type="dxa"/>
+              <w:end w:w="110" w:type="dxa"/>
+            </w:tcMar>
           </w:tcPr>
           <w:p>
             <w:r>
               <w:rPr>
-                <w:rFonts w:ascii="Aptos" w:hAnsi="Aptos"/>
                 <w:b/>
-                <w:i w:val="0"/>
-                <w:color w:val="1F4E79"/>
-                <w:sz w:val="20"/>
               </w:rPr>
               <w:t>Useful conclusion</w:t>
             </w:r>
@@ -281,15 +592,17 @@
             <w:tcW w:type="dxa" w:w="4968"/>
             <w:shd w:fill="D9EAF7"/>
             <w:vAlign w:val="center"/>
+            <w:tcMar>
+              <w:top w:w="80" w:type="dxa"/>
+              <w:start w:w="110" w:type="dxa"/>
+              <w:bottom w:w="80" w:type="dxa"/>
+              <w:end w:w="110" w:type="dxa"/>
+            </w:tcMar>
           </w:tcPr>
           <w:p>
             <w:r>
               <w:rPr>
-                <w:rFonts w:ascii="Aptos" w:hAnsi="Aptos"/>
                 <w:b/>
-                <w:i w:val="0"/>
-                <w:color w:val="1F4E79"/>
-                <w:sz w:val="20"/>
               </w:rPr>
               <w:t>Meaning</w:t>
             </w:r>
@@ -299,35 +612,35 @@
       <w:tr>
         <w:tc>
           <w:tcPr>
-            <w:tcW w:type="dxa" w:w="3312"/>
+            <w:tcW w:type="dxa" w:w="3024"/>
             <w:vAlign w:val="center"/>
+            <w:tcMar>
+              <w:top w:w="80" w:type="dxa"/>
+              <w:start w:w="110" w:type="dxa"/>
+              <w:bottom w:w="80" w:type="dxa"/>
+              <w:end w:w="110" w:type="dxa"/>
+            </w:tcMar>
           </w:tcPr>
           <w:p>
             <w:r>
-              <w:rPr>
-                <w:rFonts w:ascii="Aptos" w:hAnsi="Aptos"/>
-                <w:b w:val="0"/>
-                <w:i w:val="0"/>
-                <w:sz w:val="20"/>
-              </w:rPr>
               <w:t>Initial stop risk</w:t>
             </w:r>
           </w:p>
         </w:tc>
         <w:tc>
           <w:tcPr>
-            <w:tcW w:type="dxa" w:w="6336"/>
+            <w:tcW w:type="dxa" w:w="6768"/>
             <w:vAlign w:val="center"/>
+            <w:tcMar>
+              <w:top w:w="80" w:type="dxa"/>
+              <w:start w:w="110" w:type="dxa"/>
+              <w:bottom w:w="80" w:type="dxa"/>
+              <w:end w:w="110" w:type="dxa"/>
+            </w:tcMar>
           </w:tcPr>
           <w:p>
             <w:r>
-              <w:rPr>
-                <w:rFonts w:ascii="Aptos" w:hAnsi="Aptos"/>
-                <w:b w:val="0"/>
-                <w:i w:val="0"/>
-                <w:sz w:val="20"/>
-              </w:rPr>
-              <w:t>How much rupee risk the trade would have carried immediately after the chosen entry.</w:t>
+              <w:t>How much rupee risk the trade would have carried immediately after the assumed entry.</w:t>
             </w:r>
           </w:p>
         </w:tc>
@@ -335,35 +648,35 @@
       <w:tr>
         <w:tc>
           <w:tcPr>
-            <w:tcW w:type="dxa" w:w="3312"/>
+            <w:tcW w:type="dxa" w:w="3024"/>
             <w:vAlign w:val="center"/>
+            <w:tcMar>
+              <w:top w:w="80" w:type="dxa"/>
+              <w:start w:w="110" w:type="dxa"/>
+              <w:bottom w:w="80" w:type="dxa"/>
+              <w:end w:w="110" w:type="dxa"/>
+            </w:tcMar>
           </w:tcPr>
           <w:p>
             <w:r>
-              <w:rPr>
-                <w:rFonts w:ascii="Aptos" w:hAnsi="Aptos"/>
-                <w:b w:val="0"/>
-                <w:i w:val="0"/>
-                <w:sz w:val="20"/>
-              </w:rPr>
               <w:t>Stop evolution</w:t>
             </w:r>
           </w:p>
         </w:tc>
         <w:tc>
           <w:tcPr>
-            <w:tcW w:type="dxa" w:w="6336"/>
+            <w:tcW w:type="dxa" w:w="6768"/>
             <w:vAlign w:val="center"/>
+            <w:tcMar>
+              <w:top w:w="80" w:type="dxa"/>
+              <w:start w:w="110" w:type="dxa"/>
+              <w:bottom w:w="80" w:type="dxa"/>
+              <w:end w:w="110" w:type="dxa"/>
+            </w:tcMar>
           </w:tcPr>
           <w:p>
             <w:r>
-              <w:rPr>
-                <w:rFonts w:ascii="Aptos" w:hAnsi="Aptos"/>
-                <w:b w:val="0"/>
-                <w:i w:val="0"/>
-                <w:sz w:val="20"/>
-              </w:rPr>
-              <w:t>Whether risk tightened, stayed flat, or expanded as the market moved.</w:t>
+              <w:t>Whether risk tightened, stayed flat, or widened as the market moved after entry.</w:t>
             </w:r>
           </w:p>
         </w:tc>
@@ -371,35 +684,35 @@
       <w:tr>
         <w:tc>
           <w:tcPr>
-            <w:tcW w:type="dxa" w:w="3312"/>
+            <w:tcW w:type="dxa" w:w="3024"/>
             <w:vAlign w:val="center"/>
+            <w:tcMar>
+              <w:top w:w="80" w:type="dxa"/>
+              <w:start w:w="110" w:type="dxa"/>
+              <w:bottom w:w="80" w:type="dxa"/>
+              <w:end w:w="110" w:type="dxa"/>
+            </w:tcMar>
           </w:tcPr>
           <w:p>
             <w:r>
-              <w:rPr>
-                <w:rFonts w:ascii="Aptos" w:hAnsi="Aptos"/>
-                <w:b w:val="0"/>
-                <w:i w:val="0"/>
-                <w:sz w:val="20"/>
-              </w:rPr>
               <w:t>Capital protection</w:t>
             </w:r>
           </w:p>
         </w:tc>
         <w:tc>
           <w:tcPr>
-            <w:tcW w:type="dxa" w:w="6336"/>
+            <w:tcW w:type="dxa" w:w="6768"/>
             <w:vAlign w:val="center"/>
+            <w:tcMar>
+              <w:top w:w="80" w:type="dxa"/>
+              <w:start w:w="110" w:type="dxa"/>
+              <w:bottom w:w="80" w:type="dxa"/>
+              <w:end w:w="110" w:type="dxa"/>
+            </w:tcMar>
           </w:tcPr>
           <w:p>
             <w:r>
-              <w:rPr>
-                <w:rFonts w:ascii="Aptos" w:hAnsi="Aptos"/>
-                <w:b w:val="0"/>
-                <w:i w:val="0"/>
-                <w:sz w:val="20"/>
-              </w:rPr>
-              <w:t>Whether the stop eventually moved above entry and began protecting open profit.</w:t>
+              <w:t>Whether the stop eventually moved near or above entry and started protecting open profit.</w:t>
             </w:r>
           </w:p>
         </w:tc>
@@ -407,35 +720,35 @@
       <w:tr>
         <w:tc>
           <w:tcPr>
-            <w:tcW w:type="dxa" w:w="3312"/>
+            <w:tcW w:type="dxa" w:w="3024"/>
             <w:vAlign w:val="center"/>
+            <w:tcMar>
+              <w:top w:w="80" w:type="dxa"/>
+              <w:start w:w="110" w:type="dxa"/>
+              <w:bottom w:w="80" w:type="dxa"/>
+              <w:end w:w="110" w:type="dxa"/>
+            </w:tcMar>
           </w:tcPr>
           <w:p>
             <w:r>
-              <w:rPr>
-                <w:rFonts w:ascii="Aptos" w:hAnsi="Aptos"/>
-                <w:b w:val="0"/>
-                <w:i w:val="0"/>
-                <w:sz w:val="20"/>
-              </w:rPr>
               <w:t>Operational discipline</w:t>
             </w:r>
           </w:p>
         </w:tc>
         <w:tc>
           <w:tcPr>
-            <w:tcW w:type="dxa" w:w="6336"/>
+            <w:tcW w:type="dxa" w:w="6768"/>
             <w:vAlign w:val="center"/>
+            <w:tcMar>
+              <w:top w:w="80" w:type="dxa"/>
+              <w:start w:w="110" w:type="dxa"/>
+              <w:bottom w:w="80" w:type="dxa"/>
+              <w:end w:w="110" w:type="dxa"/>
+            </w:tcMar>
           </w:tcPr>
           <w:p>
             <w:r>
-              <w:rPr>
-                <w:rFonts w:ascii="Aptos" w:hAnsi="Aptos"/>
-                <w:b w:val="0"/>
-                <w:i w:val="0"/>
-                <w:sz w:val="20"/>
-              </w:rPr>
-              <w:t>Whether a rule-based stop process would have required updates or no action on each day.</w:t>
+              <w:t>Whether the rules would have required a stop update or no action on each day.</w:t>
             </w:r>
           </w:p>
         </w:tc>
@@ -443,280 +756,167 @@
     </w:tbl>
     <w:p/>
     <w:p>
-      <w:pPr>
-        <w:spacing w:after="60"/>
-      </w:pPr>
       <w:r>
         <w:rPr>
-          <w:rFonts w:ascii="Aptos" w:hAnsi="Aptos"/>
           <w:b/>
-          <w:i w:val="0"/>
           <w:color w:val="1F4E79"/>
-          <w:sz w:val="25"/>
+          <w:sz w:val="26"/>
         </w:rPr>
-        <w:t>Institutional-grade requirements before upgrading to LONG or SHORT</w:t>
+        <w:t>5. Minimum Institutional Standard Before LONG or SHORT</w:t>
       </w:r>
     </w:p>
     <w:p>
       <w:pPr>
-        <w:pStyle w:val="ListNumber"/>
-        <w:spacing w:after="20"/>
+        <w:spacing w:after="40"/>
       </w:pPr>
       <w:r>
         <w:rPr>
-          <w:rFonts w:ascii="Aptos" w:hAnsi="Aptos"/>
           <w:b/>
-          <w:i w:val="0"/>
-          <w:sz w:val="21"/>
         </w:rPr>
         <w:t xml:space="preserve">Entry rule: </w:t>
       </w:r>
       <w:r>
-        <w:rPr>
-          <w:rFonts w:ascii="Aptos" w:hAnsi="Aptos"/>
-          <w:b w:val="0"/>
-          <w:i w:val="0"/>
-          <w:sz w:val="21"/>
-        </w:rPr>
-        <w:t>A clearly defined trigger such as breakout, pullback, range expansion, relative-strength confirmation, or another reproducible setup.</w:t>
+        <w:t>A documented and reproducible trigger must exist before the trade is authorized.</w:t>
       </w:r>
     </w:p>
     <w:p>
       <w:pPr>
-        <w:pStyle w:val="ListNumber"/>
-        <w:spacing w:after="20"/>
+        <w:spacing w:after="40"/>
       </w:pPr>
       <w:r>
         <w:rPr>
-          <w:rFonts w:ascii="Aptos" w:hAnsi="Aptos"/>
           <w:b/>
-          <w:i w:val="0"/>
-          <w:sz w:val="21"/>
         </w:rPr>
         <w:t xml:space="preserve">Initial stop rule: </w:t>
       </w:r>
       <w:r>
-        <w:rPr>
-          <w:rFonts w:ascii="Aptos" w:hAnsi="Aptos"/>
-          <w:b w:val="0"/>
-          <w:i w:val="0"/>
-          <w:sz w:val="21"/>
-        </w:rPr>
-        <w:t>A computed initial stop with risk per unit and rupee risk per lot known before entry.</w:t>
+        <w:t>Initial rupee risk per lot must be known before entry, not inferred later.</w:t>
       </w:r>
     </w:p>
     <w:p>
       <w:pPr>
-        <w:pStyle w:val="ListNumber"/>
-        <w:spacing w:after="20"/>
+        <w:spacing w:after="40"/>
       </w:pPr>
       <w:r>
         <w:rPr>
-          <w:rFonts w:ascii="Aptos" w:hAnsi="Aptos"/>
           <w:b/>
-          <w:i w:val="0"/>
-          <w:sz w:val="21"/>
         </w:rPr>
-        <w:t xml:space="preserve">Position sizing rule: </w:t>
+        <w:t xml:space="preserve">Sizing rule: </w:t>
       </w:r>
       <w:r>
-        <w:rPr>
-          <w:rFonts w:ascii="Aptos" w:hAnsi="Aptos"/>
-          <w:b w:val="0"/>
-          <w:i w:val="0"/>
-          <w:sz w:val="21"/>
-        </w:rPr>
-        <w:t>Lots sized from a fixed loss budget rather than from discretionary comfort.</w:t>
+        <w:t>Lots must be sized from a fixed risk budget rather than from discretionary comfort.</w:t>
       </w:r>
     </w:p>
     <w:p>
       <w:pPr>
-        <w:pStyle w:val="ListNumber"/>
-        <w:spacing w:after="20"/>
+        <w:spacing w:after="40"/>
       </w:pPr>
       <w:r>
         <w:rPr>
-          <w:rFonts w:ascii="Aptos" w:hAnsi="Aptos"/>
           <w:b/>
-          <w:i w:val="0"/>
-          <w:sz w:val="21"/>
         </w:rPr>
         <w:t xml:space="preserve">Reward framework: </w:t>
       </w:r>
       <w:r>
-        <w:rPr>
-          <w:rFonts w:ascii="Aptos" w:hAnsi="Aptos"/>
-          <w:b w:val="0"/>
-          <w:i w:val="0"/>
-          <w:sz w:val="21"/>
-        </w:rPr>
-        <w:t>A target or expected payoff distribution so reward can be compared with initial risk.</w:t>
+        <w:t>Expected upside or payoff distribution must be documented so reward can be compared with risk.</w:t>
       </w:r>
     </w:p>
     <w:p>
       <w:pPr>
-        <w:pStyle w:val="ListNumber"/>
-        <w:spacing w:after="20"/>
+        <w:spacing w:after="40"/>
       </w:pPr>
       <w:r>
         <w:rPr>
-          <w:rFonts w:ascii="Aptos" w:hAnsi="Aptos"/>
           <w:b/>
-          <w:i w:val="0"/>
-          <w:sz w:val="21"/>
         </w:rPr>
         <w:t xml:space="preserve">Validation: </w:t>
       </w:r>
       <w:r>
-        <w:rPr>
-          <w:rFonts w:ascii="Aptos" w:hAnsi="Aptos"/>
-          <w:b w:val="0"/>
-          <w:i w:val="0"/>
-          <w:sz w:val="21"/>
-        </w:rPr>
-        <w:t>Historical testing across multiple dates and conditions, including drawdown and slippage assumptions.</w:t>
+        <w:t>Historical testing must cover multiple dates, volatility conditions, slippage assumptions, and drawdown behavior.</w:t>
       </w:r>
     </w:p>
     <w:p>
       <w:pPr>
-        <w:pStyle w:val="ListNumber"/>
-        <w:spacing w:after="20"/>
+        <w:spacing w:after="40"/>
       </w:pPr>
       <w:r>
         <w:rPr>
-          <w:rFonts w:ascii="Aptos" w:hAnsi="Aptos"/>
           <w:b/>
-          <w:i w:val="0"/>
-          <w:sz w:val="21"/>
         </w:rPr>
-        <w:t xml:space="preserve">Execution checklist: </w:t>
+        <w:t xml:space="preserve">Execution controls: </w:t>
       </w:r>
       <w:r>
-        <w:rPr>
-          <w:rFonts w:ascii="Aptos" w:hAnsi="Aptos"/>
-          <w:b w:val="0"/>
-          <w:i w:val="0"/>
-          <w:sz w:val="21"/>
-        </w:rPr>
-        <w:t>Liquidity, lot size, gap risk, event risk, and portfolio concentration controls.</w:t>
+        <w:t>Liquidity, lot size, event risk, gap risk, and portfolio concentration must be checked.</w:t>
       </w:r>
     </w:p>
     <w:p>
-      <w:pPr>
-        <w:spacing w:after="60"/>
-      </w:pPr>
       <w:r>
         <w:rPr>
-          <w:rFonts w:ascii="Aptos" w:hAnsi="Aptos"/>
           <w:b/>
-          <w:i w:val="0"/>
           <w:color w:val="1F4E79"/>
-          <w:sz w:val="25"/>
+          <w:sz w:val="26"/>
         </w:rPr>
-        <w:t>Recommended decision standard</w:t>
+        <w:t>6. Recommended Decision Standard</w:t>
       </w:r>
     </w:p>
     <w:p>
-      <w:pPr>
-        <w:spacing w:after="80"/>
-      </w:pPr>
       <w:r>
-        <w:rPr>
-          <w:rFonts w:ascii="Aptos" w:hAnsi="Aptos"/>
-          <w:b w:val="0"/>
-          <w:i w:val="0"/>
-          <w:sz w:val="21"/>
-        </w:rPr>
-        <w:t>Upgrade to LONG only when the trade has a valid entry trigger, an acceptable initial rupee risk per lot, and a documented reward expectation that justifies the risk budget.</w:t>
+        <w:t>Upgrade to LONG only when a valid entry trigger, an acceptable initial rupee risk per lot, and a documented reward expectation all exist together.</w:t>
       </w:r>
     </w:p>
     <w:p>
-      <w:pPr>
-        <w:spacing w:after="80"/>
-      </w:pPr>
       <w:r>
-        <w:rPr>
-          <w:rFonts w:ascii="Aptos" w:hAnsi="Aptos"/>
-          <w:b w:val="0"/>
-          <w:i w:val="0"/>
-          <w:sz w:val="21"/>
-        </w:rPr>
         <w:t>Upgrade to SHORT only when the same standard is satisfied on the short side.</w:t>
       </w:r>
     </w:p>
     <w:p>
-      <w:pPr>
-        <w:spacing w:after="80"/>
-      </w:pPr>
       <w:r>
-        <w:rPr>
-          <w:rFonts w:ascii="Aptos" w:hAnsi="Aptos"/>
-          <w:b w:val="0"/>
-          <w:i w:val="0"/>
-          <w:sz w:val="21"/>
-        </w:rPr>
         <w:t>Until that framework is added, the disciplined institutional recommendation remains NONE.</w:t>
       </w:r>
     </w:p>
     <w:p>
+      <w:r>
+        <w:rPr>
+          <w:b/>
+          <w:color w:val="1F4E79"/>
+          <w:sz w:val="26"/>
+        </w:rPr>
+        <w:t>7. Immediate Next Step</w:t>
+      </w:r>
+    </w:p>
+    <w:p>
+      <w:r>
+        <w:rPr>
+          <w:b/>
+        </w:rPr>
+        <w:t xml:space="preserve">Build a separate entry-decision layer that outputs: </w:t>
+      </w:r>
+      <w:r>
+        <w:t>signal (LONG / NONE / SHORT), entry trigger, initial stop, risk per lot, permissible lots under risk budget, and expected reward-to-risk. The existing stop engine can then manage the position after the entry has been authorized.</w:t>
+      </w:r>
+    </w:p>
+    <w:p/>
+    <w:p>
       <w:pPr>
-        <w:spacing w:after="60"/>
+        <w:jc w:val="center"/>
       </w:pPr>
       <w:r>
         <w:rPr>
-          <w:rFonts w:ascii="Aptos" w:hAnsi="Aptos"/>
-          <w:b/>
-          <w:i w:val="0"/>
-          <w:color w:val="1F4E79"/>
-          <w:sz w:val="25"/>
+          <w:i/>
+          <w:color w:val="646464"/>
+          <w:sz w:val="18"/>
         </w:rPr>
-        <w:t>Practical next step</w:t>
-      </w:r>
-    </w:p>
-    <w:p>
-      <w:pPr>
-        <w:spacing w:after="80"/>
-      </w:pPr>
-      <w:r>
-        <w:rPr>
-          <w:rFonts w:ascii="Aptos" w:hAnsi="Aptos"/>
-          <w:b w:val="0"/>
-          <w:i w:val="0"/>
-          <w:sz w:val="21"/>
-        </w:rPr>
-        <w:t>Build a separate entry-decision layer that outputs: signal (LONG / NONE / SHORT), entry trigger, initial stop, risk per lot, permissible lots under risk budget, and expected reward-to-risk. The existing stop engine can then manage the position after the entry has been authorized.</w:t>
+        <w:t>Prepared from the reviewed stop-history scenario and revised for sharper decision use.</w:t>
       </w:r>
     </w:p>
     <w:sectPr>
-      <w:footerReference w:type="default" r:id="rId9"/>
       <w:pgSz w:w="12240" w:h="15840"/>
-      <w:pgMar w:top="1080" w:right="1152" w:bottom="1008" w:left="1152" w:header="720" w:footer="720" w:gutter="0"/>
+      <w:pgMar w:top="1008" w:right="1152" w:bottom="1008" w:left="1152" w:header="720" w:footer="720" w:gutter="0"/>
       <w:cols w:space="720"/>
       <w:docGrid w:linePitch="360"/>
     </w:sectPr>
   </w:body>
 </w:document>
-</file>
-
-<file path=word/footer1.xml><?xml version="1.0" encoding="utf-8"?>
-<w:ftr xmlns:m="http://schemas.openxmlformats.org/officeDocument/2006/math" xmlns:mc="http://schemas.openxmlformats.org/markup-compatibility/2006" xmlns:mo="http://schemas.microsoft.com/office/mac/office/2008/main" xmlns:mv="urn:schemas-microsoft-com:mac:vml" xmlns:o="urn:schemas-microsoft-com:office:office" xmlns:r="http://schemas.openxmlformats.org/officeDocument/2006/relationships" xmlns:v="urn:schemas-microsoft-com:vml" xmlns:w10="urn:schemas-microsoft-com:office:word" xmlns:w14="http://schemas.microsoft.com/office/word/2010/wordml" xmlns:w="http://schemas.openxmlformats.org/wordprocessingml/2006/main" xmlns:wne="http://schemas.microsoft.com/office/word/2006/wordml" xmlns:wp14="http://schemas.microsoft.com/office/word/2010/wordprocessingDrawing" xmlns:wp="http://schemas.openxmlformats.org/drawingml/2006/wordprocessingDrawing" xmlns:wpc="http://schemas.microsoft.com/office/word/2010/wordprocessingCanvas" xmlns:wpg="http://schemas.microsoft.com/office/word/2010/wordprocessingGroup" xmlns:wpi="http://schemas.microsoft.com/office/word/2010/wordprocessingInk" xmlns:wps="http://schemas.microsoft.com/office/word/2010/wordprocessingShape" mc:Ignorable="w14 wp14">
-  <w:p>
-    <w:pPr>
-      <w:pStyle w:val="Footer"/>
-      <w:jc w:val="center"/>
-    </w:pPr>
-    <w:r>
-      <w:rPr>
-        <w:rFonts w:ascii="Aptos" w:hAnsi="Aptos"/>
-        <w:b w:val="0"/>
-        <w:i w:val="0"/>
-        <w:color w:val="646464"/>
-        <w:sz w:val="17"/>
-      </w:rPr>
-      <w:t>Prepared from the current scenario discussion</w:t>
-    </w:r>
-  </w:p>
-</w:ftr>
 </file>
 
 <file path=word/numbering.xml><?xml version="1.0" encoding="utf-8"?>
@@ -1146,7 +1346,7 @@
       <w:outlineLvl w:val="0"/>
     </w:pPr>
     <w:rPr>
-      <w:rFonts w:asciiTheme="majorHAnsi" w:eastAsiaTheme="majorEastAsia" w:hAnsiTheme="majorHAnsi" w:cstheme="majorBidi" w:ascii="Aptos" w:hAnsi="Aptos"/>
+      <w:rFonts w:asciiTheme="majorHAnsi" w:eastAsiaTheme="majorEastAsia" w:hAnsiTheme="majorHAnsi" w:cstheme="majorBidi"/>
       <w:b/>
       <w:bCs/>
       <w:color w:val="365F91" w:themeColor="accent1" w:themeShade="BF"/>
@@ -1170,7 +1370,7 @@
       <w:outlineLvl w:val="1"/>
     </w:pPr>
     <w:rPr>
-      <w:rFonts w:asciiTheme="majorHAnsi" w:eastAsiaTheme="majorEastAsia" w:hAnsiTheme="majorHAnsi" w:cstheme="majorBidi" w:ascii="Aptos" w:hAnsi="Aptos"/>
+      <w:rFonts w:asciiTheme="majorHAnsi" w:eastAsiaTheme="majorEastAsia" w:hAnsiTheme="majorHAnsi" w:cstheme="majorBidi"/>
       <w:b/>
       <w:bCs/>
       <w:color w:val="4F81BD" w:themeColor="accent1"/>
@@ -1194,7 +1394,7 @@
       <w:outlineLvl w:val="2"/>
     </w:pPr>
     <w:rPr>
-      <w:rFonts w:asciiTheme="majorHAnsi" w:eastAsiaTheme="majorEastAsia" w:hAnsiTheme="majorHAnsi" w:cstheme="majorBidi" w:ascii="Aptos" w:hAnsi="Aptos"/>
+      <w:rFonts w:asciiTheme="majorHAnsi" w:eastAsiaTheme="majorEastAsia" w:hAnsiTheme="majorHAnsi" w:cstheme="majorBidi"/>
       <w:b/>
       <w:bCs/>
       <w:color w:val="4F81BD" w:themeColor="accent1"/>
@@ -1435,7 +1635,7 @@
       <w:contextualSpacing/>
     </w:pPr>
     <w:rPr>
-      <w:rFonts w:asciiTheme="majorHAnsi" w:eastAsiaTheme="majorEastAsia" w:hAnsiTheme="majorHAnsi" w:cstheme="majorBidi" w:ascii="Aptos" w:hAnsi="Aptos"/>
+      <w:rFonts w:asciiTheme="majorHAnsi" w:eastAsiaTheme="majorEastAsia" w:hAnsiTheme="majorHAnsi" w:cstheme="majorBidi"/>
       <w:color w:val="17365D" w:themeColor="text2" w:themeShade="BF"/>
       <w:spacing w:val="5"/>
       <w:kern w:val="28"/>
@@ -1472,7 +1672,7 @@
       </w:numPr>
     </w:pPr>
     <w:rPr>
-      <w:rFonts w:asciiTheme="majorHAnsi" w:eastAsiaTheme="majorEastAsia" w:hAnsiTheme="majorHAnsi" w:cstheme="majorBidi" w:ascii="Aptos" w:hAnsi="Aptos"/>
+      <w:rFonts w:asciiTheme="majorHAnsi" w:eastAsiaTheme="majorEastAsia" w:hAnsiTheme="majorHAnsi" w:cstheme="majorBidi"/>
       <w:i/>
       <w:iCs/>
       <w:color w:val="4F81BD" w:themeColor="accent1"/>

</xml_diff>